<commit_message>
Use one-page black-and-white submission details format
</commit_message>
<xml_diff>
--- a/Unmesh_230911030_FGAI_Assignment2.docx
+++ b/Unmesh_230911030_FGAI_Assignment2.docx
@@ -4,87 +4,91 @@
   <w:body>
     <w:p>
       <w:pPr>
-        <w:pStyle w:val="Heading1"/>
+        <w:spacing w:after="100"/>
         <w:jc w:val="center"/>
       </w:pPr>
       <w:r>
-        <w:t>Foundations of Generative AI (ICT4403) - Assignment 2</w:t>
+        <w:rPr>
+          <w:rFonts w:ascii="Times New Roman" w:hAnsi="Times New Roman" w:eastAsia="Times New Roman"/>
+          <w:b/>
+          <w:i w:val="0"/>
+          <w:color w:val="000000"/>
+          <w:sz w:val="36"/>
+        </w:rPr>
+        <w:t>Foundations of Generative AI (ICT4403)</w:t>
       </w:r>
     </w:p>
     <w:p>
       <w:pPr>
+        <w:spacing w:after="440"/>
         <w:jc w:val="center"/>
       </w:pPr>
       <w:r>
         <w:rPr>
-          <w:i/>
+          <w:rFonts w:ascii="Times New Roman" w:hAnsi="Times New Roman" w:eastAsia="Times New Roman"/>
+          <w:b w:val="0"/>
+          <w:i w:val="0"/>
+          <w:color w:val="000000"/>
+          <w:sz w:val="26"/>
         </w:rPr>
-        <w:t>Next-Word Prediction and Temperature-Controlled Text Generation: Simple RNN vs Bidirectional RNN vs LSTM vs GRU</w:t>
+        <w:t>Assignment 2 - Submission Details</w:t>
       </w:r>
     </w:p>
     <w:tbl>
       <w:tblPr>
-        <w:tblStyle w:val="LightGrid-Accent1"/>
         <w:tblW w:type="auto" w:w="0"/>
         <w:jc w:val="center"/>
+        <w:tblLayout w:type="fixed"/>
         <w:tblLook w:firstColumn="1" w:firstRow="1" w:lastColumn="0" w:lastRow="0" w:noHBand="0" w:noVBand="1" w:val="04A0"/>
+        <w:tblBorders>
+          <w:top w:val="single" w:sz="6" w:color="000000"/>
+          <w:left w:val="single" w:sz="6" w:color="000000"/>
+          <w:bottom w:val="single" w:sz="6" w:color="000000"/>
+          <w:right w:val="single" w:sz="6" w:color="000000"/>
+          <w:insideH w:val="single" w:sz="6" w:color="000000"/>
+          <w:insideV w:val="single" w:sz="6" w:color="000000"/>
+        </w:tblBorders>
       </w:tblPr>
       <w:tblGrid>
-        <w:gridCol w:w="4986"/>
-        <w:gridCol w:w="4986"/>
+        <w:gridCol w:w="4680"/>
+        <w:gridCol w:w="4680"/>
       </w:tblGrid>
       <w:tr>
         <w:tc>
           <w:tcPr>
-            <w:tcW w:type="dxa" w:w="2551"/>
+            <w:tcW w:type="dxa" w:w="3240"/>
           </w:tcPr>
           <w:p>
+            <w:pPr>
+              <w:spacing w:before="100" w:after="100"/>
+            </w:pPr>
             <w:r>
               <w:rPr>
+                <w:rFonts w:ascii="Times New Roman" w:hAnsi="Times New Roman" w:eastAsia="Times New Roman"/>
                 <w:b/>
-                <w:sz w:val="18"/>
+                <w:i w:val="0"/>
+                <w:color w:val="000000"/>
+                <w:sz w:val="21"/>
               </w:rPr>
-              <w:t>Field</w:t>
+              <w:t>Student name</w:t>
             </w:r>
           </w:p>
         </w:tc>
         <w:tc>
           <w:tcPr>
-            <w:tcW w:type="dxa" w:w="7087"/>
+            <w:tcW w:type="dxa" w:w="6120"/>
           </w:tcPr>
           <w:p>
+            <w:pPr>
+              <w:spacing w:before="100" w:after="100"/>
+            </w:pPr>
             <w:r>
               <w:rPr>
-                <w:b/>
-                <w:sz w:val="18"/>
-              </w:rPr>
-              <w:t>Details</w:t>
-            </w:r>
-          </w:p>
-        </w:tc>
-      </w:tr>
-      <w:tr>
-        <w:tc>
-          <w:tcPr>
-            <w:tcW w:type="dxa" w:w="2551"/>
-          </w:tcPr>
-          <w:p>
-            <w:r>
-              <w:rPr>
-                <w:sz w:val="18"/>
-              </w:rPr>
-              <w:t>Student Name</w:t>
-            </w:r>
-          </w:p>
-        </w:tc>
-        <w:tc>
-          <w:tcPr>
-            <w:tcW w:type="dxa" w:w="7087"/>
-          </w:tcPr>
-          <w:p>
-            <w:r>
-              <w:rPr>
-                <w:sz w:val="18"/>
+                <w:rFonts w:ascii="Times New Roman" w:hAnsi="Times New Roman" w:eastAsia="Times New Roman"/>
+                <w:b w:val="0"/>
+                <w:i w:val="0"/>
+                <w:color w:val="000000"/>
+                <w:sz w:val="21"/>
               </w:rPr>
               <w:t>Unmesh</w:t>
             </w:r>
@@ -94,25 +98,39 @@
       <w:tr>
         <w:tc>
           <w:tcPr>
-            <w:tcW w:type="dxa" w:w="2551"/>
+            <w:tcW w:type="dxa" w:w="3240"/>
           </w:tcPr>
           <w:p>
+            <w:pPr>
+              <w:spacing w:before="100" w:after="100"/>
+            </w:pPr>
             <w:r>
               <w:rPr>
-                <w:sz w:val="18"/>
+                <w:rFonts w:ascii="Times New Roman" w:hAnsi="Times New Roman" w:eastAsia="Times New Roman"/>
+                <w:b/>
+                <w:i w:val="0"/>
+                <w:color w:val="000000"/>
+                <w:sz w:val="21"/>
               </w:rPr>
-              <w:t>Registration Number</w:t>
+              <w:t>Registration number</w:t>
             </w:r>
           </w:p>
         </w:tc>
         <w:tc>
           <w:tcPr>
-            <w:tcW w:type="dxa" w:w="7087"/>
+            <w:tcW w:type="dxa" w:w="6120"/>
           </w:tcPr>
           <w:p>
+            <w:pPr>
+              <w:spacing w:before="100" w:after="100"/>
+            </w:pPr>
             <w:r>
               <w:rPr>
-                <w:sz w:val="18"/>
+                <w:rFonts w:ascii="Times New Roman" w:hAnsi="Times New Roman" w:eastAsia="Times New Roman"/>
+                <w:b w:val="0"/>
+                <w:i w:val="0"/>
+                <w:color w:val="000000"/>
+                <w:sz w:val="21"/>
               </w:rPr>
               <w:t>230911030</w:t>
             </w:r>
@@ -122,27 +140,41 @@
       <w:tr>
         <w:tc>
           <w:tcPr>
-            <w:tcW w:type="dxa" w:w="2551"/>
+            <w:tcW w:type="dxa" w:w="3240"/>
           </w:tcPr>
           <w:p>
+            <w:pPr>
+              <w:spacing w:before="100" w:after="100"/>
+            </w:pPr>
             <w:r>
               <w:rPr>
-                <w:sz w:val="18"/>
+                <w:rFonts w:ascii="Times New Roman" w:hAnsi="Times New Roman" w:eastAsia="Times New Roman"/>
+                <w:b/>
+                <w:i w:val="0"/>
+                <w:color w:val="000000"/>
+                <w:sz w:val="21"/>
               </w:rPr>
-              <w:t>Course</w:t>
+              <w:t>Assignment title</w:t>
             </w:r>
           </w:p>
         </w:tc>
         <w:tc>
           <w:tcPr>
-            <w:tcW w:type="dxa" w:w="7087"/>
+            <w:tcW w:type="dxa" w:w="6120"/>
           </w:tcPr>
           <w:p>
+            <w:pPr>
+              <w:spacing w:before="100" w:after="100"/>
+            </w:pPr>
             <w:r>
               <w:rPr>
-                <w:sz w:val="18"/>
+                <w:rFonts w:ascii="Times New Roman" w:hAnsi="Times New Roman" w:eastAsia="Times New Roman"/>
+                <w:b w:val="0"/>
+                <w:i w:val="0"/>
+                <w:color w:val="000000"/>
+                <w:sz w:val="21"/>
               </w:rPr>
-              <w:t>Foundations of Generative AI (ICT4403)</w:t>
+              <w:t>Foundations of Generative AI (ICT4403) - Assignment 2</w:t>
             </w:r>
           </w:p>
         </w:tc>
@@ -150,27 +182,61 @@
       <w:tr>
         <w:tc>
           <w:tcPr>
-            <w:tcW w:type="dxa" w:w="2551"/>
+            <w:tcW w:type="dxa" w:w="3240"/>
           </w:tcPr>
           <w:p>
+            <w:pPr>
+              <w:spacing w:before="100" w:after="100"/>
+            </w:pPr>
             <w:r>
               <w:rPr>
-                <w:sz w:val="18"/>
+                <w:rFonts w:ascii="Times New Roman" w:hAnsi="Times New Roman" w:eastAsia="Times New Roman"/>
+                <w:b/>
+                <w:i w:val="0"/>
+                <w:color w:val="000000"/>
+                <w:sz w:val="21"/>
               </w:rPr>
-              <w:t>Dataset</w:t>
+              <w:t>Title of the developed autoregressive text-generation system</w:t>
             </w:r>
           </w:p>
         </w:tc>
         <w:tc>
           <w:tcPr>
-            <w:tcW w:type="dxa" w:w="7087"/>
+            <w:tcW w:type="dxa" w:w="6120"/>
           </w:tcPr>
           <w:p>
+            <w:pPr>
+              <w:spacing w:before="100" w:after="100"/>
+            </w:pPr>
             <w:r>
               <w:rPr>
-                <w:sz w:val="18"/>
+                <w:rFonts w:ascii="Times New Roman" w:hAnsi="Times New Roman" w:eastAsia="Times New Roman"/>
+                <w:b w:val="0"/>
+                <w:i w:val="0"/>
+                <w:color w:val="000000"/>
+                <w:sz w:val="21"/>
               </w:rPr>
-              <w:t>A Study in Scarlet - Arthur Conan Doyle (Project Gutenberg #244)</w:t>
+              <w:t xml:space="preserve">Comparative Word-Level Autoregressive Next-Word Prediction and Temperature-Controlled Text Generation on Arthur Conan Doyle's </w:t>
+            </w:r>
+            <w:r>
+              <w:rPr>
+                <w:rFonts w:ascii="Times New Roman" w:hAnsi="Times New Roman" w:eastAsia="Times New Roman"/>
+                <w:b w:val="0"/>
+                <w:i/>
+                <w:color w:val="000000"/>
+                <w:sz w:val="21"/>
+              </w:rPr>
+              <w:t>A Study in Scarlet</w:t>
+            </w:r>
+            <w:r>
+              <w:rPr>
+                <w:rFonts w:ascii="Times New Roman" w:hAnsi="Times New Roman" w:eastAsia="Times New Roman"/>
+                <w:b w:val="0"/>
+                <w:i w:val="0"/>
+                <w:color w:val="000000"/>
+                <w:sz w:val="21"/>
+              </w:rPr>
+              <w:t xml:space="preserve"> using Simple RNN, Bidirectional RNN, LSTM, and GRU</w:t>
             </w:r>
           </w:p>
         </w:tc>
@@ -178,27 +244,41 @@
       <w:tr>
         <w:tc>
           <w:tcPr>
-            <w:tcW w:type="dxa" w:w="2551"/>
+            <w:tcW w:type="dxa" w:w="3240"/>
           </w:tcPr>
           <w:p>
+            <w:pPr>
+              <w:spacing w:before="100" w:after="100"/>
+            </w:pPr>
             <w:r>
               <w:rPr>
-                <w:sz w:val="18"/>
+                <w:rFonts w:ascii="Times New Roman" w:hAnsi="Times New Roman" w:eastAsia="Times New Roman"/>
+                <w:b/>
+                <w:i w:val="0"/>
+                <w:color w:val="000000"/>
+                <w:sz w:val="21"/>
               </w:rPr>
-              <w:t>Dataset Link</w:t>
+              <w:t>Dataset name</w:t>
             </w:r>
           </w:p>
         </w:tc>
         <w:tc>
           <w:tcPr>
-            <w:tcW w:type="dxa" w:w="7087"/>
+            <w:tcW w:type="dxa" w:w="6120"/>
           </w:tcPr>
           <w:p>
+            <w:pPr>
+              <w:spacing w:before="100" w:after="100"/>
+            </w:pPr>
             <w:r>
               <w:rPr>
-                <w:sz w:val="18"/>
+                <w:rFonts w:ascii="Times New Roman" w:hAnsi="Times New Roman" w:eastAsia="Times New Roman"/>
+                <w:b w:val="0"/>
+                <w:i w:val="0"/>
+                <w:color w:val="000000"/>
+                <w:sz w:val="21"/>
               </w:rPr>
-              <w:t>https://www.gutenberg.org/ebooks/244</w:t>
+              <w:t>A Study in Scarlet by Arthur Conan Doyle (Project Gutenberg eBook #244)</w:t>
             </w:r>
           </w:p>
         </w:tc>
@@ -206,1891 +286,91 @@
       <w:tr>
         <w:tc>
           <w:tcPr>
-            <w:tcW w:type="dxa" w:w="2551"/>
+            <w:tcW w:type="dxa" w:w="3240"/>
           </w:tcPr>
           <w:p>
+            <w:pPr>
+              <w:spacing w:before="100" w:after="100"/>
+            </w:pPr>
             <w:r>
               <w:rPr>
-                <w:sz w:val="18"/>
+                <w:rFonts w:ascii="Times New Roman" w:hAnsi="Times New Roman" w:eastAsia="Times New Roman"/>
+                <w:b/>
+                <w:i w:val="0"/>
+                <w:color w:val="000000"/>
+                <w:sz w:val="21"/>
               </w:rPr>
-              <w:t>GitHub Repository</w:t>
+              <w:t>Dataset link</w:t>
             </w:r>
           </w:p>
         </w:tc>
         <w:tc>
           <w:tcPr>
-            <w:tcW w:type="dxa" w:w="7087"/>
+            <w:tcW w:type="dxa" w:w="6120"/>
           </w:tcPr>
           <w:p>
-            <w:r>
-              <w:rPr>
-                <w:sz w:val="18"/>
-              </w:rPr>
-              <w:t>https://github.com/unmesh1621-ai/fgai-rnn-text-generation</w:t>
-            </w:r>
-          </w:p>
-        </w:tc>
-      </w:tr>
-    </w:tbl>
-    <w:p>
-      <w:pPr>
-        <w:pStyle w:val="Heading2"/>
-      </w:pPr>
-      <w:r>
-        <w:t>1. Objective</w:t>
-      </w:r>
-    </w:p>
-    <w:p>
-      <w:r>
-        <w:t>Train four word-level recurrent language models that predict the next word from the previous 10 words, compare them on held-out text, and study how sampling temperature changes the quality and diversity of generated text.</w:t>
-      </w:r>
-    </w:p>
-    <w:p>
-      <w:pPr>
-        <w:pStyle w:val="Heading2"/>
-      </w:pPr>
-      <w:r>
-        <w:t>2. Data and Method</w:t>
-      </w:r>
-    </w:p>
-    <w:p>
-      <w:pPr>
-        <w:pStyle w:val="ListBullet"/>
-      </w:pPr>
-      <w:r>
-        <w:t>Corpus: 49,681 tokens after removing the Gutenberg header/footer, lowercasing and splitting words and punctuation.</w:t>
-      </w:r>
-    </w:p>
-    <w:p>
-      <w:pPr>
-        <w:pStyle w:val="ListBullet"/>
-      </w:pPr>
-      <w:r>
-        <w:t>Contiguous 80/10/10 split (39,744 / 4,968 / 4,969 tokens), so no window appears in two splits.</w:t>
-      </w:r>
-    </w:p>
-    <w:p>
-      <w:pPr>
-        <w:pStyle w:val="ListBullet"/>
-      </w:pPr>
-      <w:r>
-        <w:t>Vocabulary built from the training split only (words seen at least 3 times): 1,543 entries; 12.2% of test tokens are unknown.</w:t>
-      </w:r>
-    </w:p>
-    <w:p>
-      <w:pPr>
-        <w:pStyle w:val="ListBullet"/>
-      </w:pPr>
-      <w:r>
-        <w:t>Shared architecture: Embedding(256) -&gt; recurrent core (256 units) -&gt; LayerNorm -&gt; Dropout(0.4) -&gt; Linear(vocab). The BiRNN averages both directions over the window.</w:t>
-      </w:r>
-    </w:p>
-    <w:p>
-      <w:pPr>
-        <w:pStyle w:val="ListBullet"/>
-      </w:pPr>
-      <w:r>
-        <w:t>Training: AdamW (lr 2e-3), batch 128, gradient clipping 0.5, learning-rate halving on plateau, early stopping (patience 3); the best validation checkpoint is tested.</w:t>
-      </w:r>
-    </w:p>
-    <w:p>
-      <w:pPr>
-        <w:pStyle w:val="ListBullet"/>
-      </w:pPr>
-      <w:r>
-        <w:t>Hyperparameters were tuned on validation loss only; the test set was used once.</w:t>
-      </w:r>
-    </w:p>
-    <w:p>
-      <w:pPr>
-        <w:pStyle w:val="Heading2"/>
-      </w:pPr>
-      <w:r>
-        <w:t>3. Test Results</w:t>
-      </w:r>
-    </w:p>
-    <w:tbl>
-      <w:tblPr>
-        <w:tblStyle w:val="LightGrid-Accent1"/>
-        <w:tblW w:type="auto" w:w="0"/>
-        <w:jc w:val="center"/>
-        <w:tblLook w:firstColumn="1" w:firstRow="1" w:lastColumn="0" w:lastRow="0" w:noHBand="0" w:noVBand="1" w:val="04A0"/>
-      </w:tblPr>
-      <w:tblGrid>
-        <w:gridCol w:w="1425"/>
-        <w:gridCol w:w="1425"/>
-        <w:gridCol w:w="1425"/>
-        <w:gridCol w:w="1425"/>
-        <w:gridCol w:w="1425"/>
-        <w:gridCol w:w="1425"/>
-        <w:gridCol w:w="1425"/>
-      </w:tblGrid>
-      <w:tr>
-        <w:tc>
-          <w:tcPr>
-            <w:tcW w:type="dxa" w:w="1425"/>
-          </w:tcPr>
-          <w:p>
-            <w:r>
-              <w:rPr>
-                <w:b/>
-                <w:sz w:val="18"/>
-              </w:rPr>
-              <w:t>Model</w:t>
-            </w:r>
-          </w:p>
-        </w:tc>
-        <w:tc>
-          <w:tcPr>
-            <w:tcW w:type="dxa" w:w="1425"/>
-          </w:tcPr>
-          <w:p>
-            <w:r>
-              <w:rPr>
-                <w:b/>
-                <w:sz w:val="18"/>
-              </w:rPr>
-              <w:t>Params</w:t>
-            </w:r>
-          </w:p>
-        </w:tc>
-        <w:tc>
-          <w:tcPr>
-            <w:tcW w:type="dxa" w:w="1425"/>
-          </w:tcPr>
-          <w:p>
-            <w:r>
-              <w:rPr>
-                <w:b/>
-                <w:sz w:val="18"/>
-              </w:rPr>
-              <w:t>Best epoch</w:t>
-            </w:r>
-          </w:p>
-        </w:tc>
-        <w:tc>
-          <w:tcPr>
-            <w:tcW w:type="dxa" w:w="1425"/>
-          </w:tcPr>
-          <w:p>
-            <w:r>
-              <w:rPr>
-                <w:b/>
-                <w:sz w:val="18"/>
-              </w:rPr>
-              <w:t>Loss</w:t>
-            </w:r>
-          </w:p>
-        </w:tc>
-        <w:tc>
-          <w:tcPr>
-            <w:tcW w:type="dxa" w:w="1425"/>
-          </w:tcPr>
-          <w:p>
-            <w:r>
-              <w:rPr>
-                <w:b/>
-                <w:sz w:val="18"/>
-              </w:rPr>
-              <w:t>Perplexity</w:t>
-            </w:r>
-          </w:p>
-        </w:tc>
-        <w:tc>
-          <w:tcPr>
-            <w:tcW w:type="dxa" w:w="1425"/>
-          </w:tcPr>
-          <w:p>
-            <w:r>
-              <w:rPr>
-                <w:b/>
-                <w:sz w:val="18"/>
-              </w:rPr>
-              <w:t>Top-1</w:t>
-            </w:r>
-          </w:p>
-        </w:tc>
-        <w:tc>
-          <w:tcPr>
-            <w:tcW w:type="dxa" w:w="1425"/>
-          </w:tcPr>
-          <w:p>
-            <w:r>
-              <w:rPr>
-                <w:b/>
-                <w:sz w:val="18"/>
-              </w:rPr>
-              <w:t>Top-5</w:t>
-            </w:r>
+            <w:pPr>
+              <w:spacing w:before="100" w:after="100"/>
+            </w:pPr>
+            <w:hyperlink r:id="rId9">
+              <w:r>
+                <w:rPr>
+                  <w:rFonts w:ascii="Times New Roman" w:hAnsi="Times New Roman" w:eastAsia="Times New Roman" w:cs="Times New Roman"/>
+                  <w:color w:val="000000"/>
+                  <w:sz w:val="21"/>
+                </w:rPr>
+                <w:t>https://www.gutenberg.org/cache/epub/244/pg244.txt</w:t>
+              </w:r>
+            </w:hyperlink>
           </w:p>
         </w:tc>
       </w:tr>
       <w:tr>
         <w:tc>
           <w:tcPr>
-            <w:tcW w:type="dxa" w:w="1425"/>
+            <w:tcW w:type="dxa" w:w="3240"/>
           </w:tcPr>
           <w:p>
+            <w:pPr>
+              <w:spacing w:before="100" w:after="100"/>
+            </w:pPr>
             <w:r>
               <w:rPr>
-                <w:sz w:val="18"/>
+                <w:rFonts w:ascii="Times New Roman" w:hAnsi="Times New Roman" w:eastAsia="Times New Roman"/>
+                <w:b/>
+                <w:i w:val="0"/>
+                <w:color w:val="000000"/>
+                <w:sz w:val="21"/>
               </w:rPr>
-              <w:t>Simple RNN</w:t>
+              <w:t>GitHub repository link</w:t>
             </w:r>
           </w:p>
         </w:tc>
         <w:tc>
           <w:tcPr>
-            <w:tcW w:type="dxa" w:w="1425"/>
+            <w:tcW w:type="dxa" w:w="6120"/>
           </w:tcPr>
           <w:p>
-            <w:r>
-              <w:rPr>
-                <w:sz w:val="18"/>
-              </w:rPr>
-              <w:t>923,655</w:t>
-            </w:r>
-          </w:p>
-        </w:tc>
-        <w:tc>
-          <w:tcPr>
-            <w:tcW w:type="dxa" w:w="1425"/>
-          </w:tcPr>
-          <w:p>
-            <w:r>
-              <w:rPr>
-                <w:sz w:val="18"/>
-              </w:rPr>
-              <w:t>11</w:t>
-            </w:r>
-          </w:p>
-        </w:tc>
-        <w:tc>
-          <w:tcPr>
-            <w:tcW w:type="dxa" w:w="1425"/>
-          </w:tcPr>
-          <w:p>
-            <w:r>
-              <w:rPr>
-                <w:sz w:val="18"/>
-              </w:rPr>
-              <w:t>4.120</w:t>
-            </w:r>
-          </w:p>
-        </w:tc>
-        <w:tc>
-          <w:tcPr>
-            <w:tcW w:type="dxa" w:w="1425"/>
-          </w:tcPr>
-          <w:p>
-            <w:r>
-              <w:rPr>
-                <w:sz w:val="18"/>
-              </w:rPr>
-              <w:t>61.6</w:t>
-            </w:r>
-          </w:p>
-        </w:tc>
-        <w:tc>
-          <w:tcPr>
-            <w:tcW w:type="dxa" w:w="1425"/>
-          </w:tcPr>
-          <w:p>
-            <w:r>
-              <w:rPr>
-                <w:sz w:val="18"/>
-              </w:rPr>
-              <w:t>21.3%</w:t>
-            </w:r>
-          </w:p>
-        </w:tc>
-        <w:tc>
-          <w:tcPr>
-            <w:tcW w:type="dxa" w:w="1425"/>
-          </w:tcPr>
-          <w:p>
-            <w:r>
-              <w:rPr>
-                <w:sz w:val="18"/>
-              </w:rPr>
-              <w:t>47.8%</w:t>
-            </w:r>
-          </w:p>
-        </w:tc>
-      </w:tr>
-      <w:tr>
-        <w:tc>
-          <w:tcPr>
-            <w:tcW w:type="dxa" w:w="1425"/>
-          </w:tcPr>
-          <w:p>
-            <w:r>
-              <w:rPr>
-                <w:sz w:val="18"/>
-              </w:rPr>
-              <w:t>Bidirectional RNN</w:t>
-            </w:r>
-          </w:p>
-        </w:tc>
-        <w:tc>
-          <w:tcPr>
-            <w:tcW w:type="dxa" w:w="1425"/>
-          </w:tcPr>
-          <w:p>
-            <w:r>
-              <w:rPr>
-                <w:sz w:val="18"/>
-              </w:rPr>
-              <w:t>1,450,759</w:t>
-            </w:r>
-          </w:p>
-        </w:tc>
-        <w:tc>
-          <w:tcPr>
-            <w:tcW w:type="dxa" w:w="1425"/>
-          </w:tcPr>
-          <w:p>
-            <w:r>
-              <w:rPr>
-                <w:sz w:val="18"/>
-              </w:rPr>
-              <w:t>5</w:t>
-            </w:r>
-          </w:p>
-        </w:tc>
-        <w:tc>
-          <w:tcPr>
-            <w:tcW w:type="dxa" w:w="1425"/>
-          </w:tcPr>
-          <w:p>
-            <w:r>
-              <w:rPr>
-                <w:sz w:val="18"/>
-              </w:rPr>
-              <w:t>4.285</w:t>
-            </w:r>
-          </w:p>
-        </w:tc>
-        <w:tc>
-          <w:tcPr>
-            <w:tcW w:type="dxa" w:w="1425"/>
-          </w:tcPr>
-          <w:p>
-            <w:r>
-              <w:rPr>
-                <w:sz w:val="18"/>
-              </w:rPr>
-              <w:t>72.6</w:t>
-            </w:r>
-          </w:p>
-        </w:tc>
-        <w:tc>
-          <w:tcPr>
-            <w:tcW w:type="dxa" w:w="1425"/>
-          </w:tcPr>
-          <w:p>
-            <w:r>
-              <w:rPr>
-                <w:sz w:val="18"/>
-              </w:rPr>
-              <w:t>19.7%</w:t>
-            </w:r>
-          </w:p>
-        </w:tc>
-        <w:tc>
-          <w:tcPr>
-            <w:tcW w:type="dxa" w:w="1425"/>
-          </w:tcPr>
-          <w:p>
-            <w:r>
-              <w:rPr>
-                <w:sz w:val="18"/>
-              </w:rPr>
-              <w:t>44.6%</w:t>
-            </w:r>
-          </w:p>
-        </w:tc>
-      </w:tr>
-      <w:tr>
-        <w:tc>
-          <w:tcPr>
-            <w:tcW w:type="dxa" w:w="1425"/>
-          </w:tcPr>
-          <w:p>
-            <w:r>
-              <w:rPr>
-                <w:sz w:val="18"/>
-              </w:rPr>
-              <w:t>LSTM</w:t>
-            </w:r>
-          </w:p>
-        </w:tc>
-        <w:tc>
-          <w:tcPr>
-            <w:tcW w:type="dxa" w:w="1425"/>
-          </w:tcPr>
-          <w:p>
-            <w:r>
-              <w:rPr>
-                <w:sz w:val="18"/>
-              </w:rPr>
-              <w:t>1,318,407</w:t>
-            </w:r>
-          </w:p>
-        </w:tc>
-        <w:tc>
-          <w:tcPr>
-            <w:tcW w:type="dxa" w:w="1425"/>
-          </w:tcPr>
-          <w:p>
-            <w:r>
-              <w:rPr>
-                <w:sz w:val="18"/>
-              </w:rPr>
-              <w:t>4</w:t>
-            </w:r>
-          </w:p>
-        </w:tc>
-        <w:tc>
-          <w:tcPr>
-            <w:tcW w:type="dxa" w:w="1425"/>
-          </w:tcPr>
-          <w:p>
-            <w:r>
-              <w:rPr>
-                <w:sz w:val="18"/>
-              </w:rPr>
-              <w:t>4.099</w:t>
-            </w:r>
-          </w:p>
-        </w:tc>
-        <w:tc>
-          <w:tcPr>
-            <w:tcW w:type="dxa" w:w="1425"/>
-          </w:tcPr>
-          <w:p>
-            <w:r>
-              <w:rPr>
-                <w:sz w:val="18"/>
-              </w:rPr>
-              <w:t>60.3</w:t>
-            </w:r>
-          </w:p>
-        </w:tc>
-        <w:tc>
-          <w:tcPr>
-            <w:tcW w:type="dxa" w:w="1425"/>
-          </w:tcPr>
-          <w:p>
-            <w:r>
-              <w:rPr>
-                <w:sz w:val="18"/>
-              </w:rPr>
-              <w:t>21.9%</w:t>
-            </w:r>
-          </w:p>
-        </w:tc>
-        <w:tc>
-          <w:tcPr>
-            <w:tcW w:type="dxa" w:w="1425"/>
-          </w:tcPr>
-          <w:p>
-            <w:r>
-              <w:rPr>
-                <w:sz w:val="18"/>
-              </w:rPr>
-              <w:t>47.2%</w:t>
-            </w:r>
-          </w:p>
-        </w:tc>
-      </w:tr>
-      <w:tr>
-        <w:tc>
-          <w:tcPr>
-            <w:tcW w:type="dxa" w:w="1425"/>
-          </w:tcPr>
-          <w:p>
-            <w:r>
-              <w:rPr>
-                <w:sz w:val="18"/>
-              </w:rPr>
-              <w:t>GRU</w:t>
-            </w:r>
-          </w:p>
-        </w:tc>
-        <w:tc>
-          <w:tcPr>
-            <w:tcW w:type="dxa" w:w="1425"/>
-          </w:tcPr>
-          <w:p>
-            <w:r>
-              <w:rPr>
-                <w:sz w:val="18"/>
-              </w:rPr>
-              <w:t>1,186,823</w:t>
-            </w:r>
-          </w:p>
-        </w:tc>
-        <w:tc>
-          <w:tcPr>
-            <w:tcW w:type="dxa" w:w="1425"/>
-          </w:tcPr>
-          <w:p>
-            <w:r>
-              <w:rPr>
-                <w:sz w:val="18"/>
-              </w:rPr>
-              <w:t>4</w:t>
-            </w:r>
-          </w:p>
-        </w:tc>
-        <w:tc>
-          <w:tcPr>
-            <w:tcW w:type="dxa" w:w="1425"/>
-          </w:tcPr>
-          <w:p>
-            <w:r>
-              <w:rPr>
-                <w:sz w:val="18"/>
-              </w:rPr>
-              <w:t>4.130</w:t>
-            </w:r>
-          </w:p>
-        </w:tc>
-        <w:tc>
-          <w:tcPr>
-            <w:tcW w:type="dxa" w:w="1425"/>
-          </w:tcPr>
-          <w:p>
-            <w:r>
-              <w:rPr>
-                <w:sz w:val="18"/>
-              </w:rPr>
-              <w:t>62.2</w:t>
-            </w:r>
-          </w:p>
-        </w:tc>
-        <w:tc>
-          <w:tcPr>
-            <w:tcW w:type="dxa" w:w="1425"/>
-          </w:tcPr>
-          <w:p>
-            <w:r>
-              <w:rPr>
-                <w:sz w:val="18"/>
-              </w:rPr>
-              <w:t>21.2%</w:t>
-            </w:r>
-          </w:p>
-        </w:tc>
-        <w:tc>
-          <w:tcPr>
-            <w:tcW w:type="dxa" w:w="1425"/>
-          </w:tcPr>
-          <w:p>
-            <w:r>
-              <w:rPr>
-                <w:sz w:val="18"/>
-              </w:rPr>
-              <w:t>47.0%</w:t>
-            </w:r>
+            <w:pPr>
+              <w:spacing w:before="100" w:after="100"/>
+            </w:pPr>
+            <w:hyperlink r:id="rId10">
+              <w:r>
+                <w:rPr>
+                  <w:rFonts w:ascii="Times New Roman" w:hAnsi="Times New Roman" w:eastAsia="Times New Roman" w:cs="Times New Roman"/>
+                  <w:color w:val="000000"/>
+                  <w:sz w:val="21"/>
+                </w:rPr>
+                <w:t>https://github.com/unmesh1621-ai/fgai-rnn-text-generation</w:t>
+              </w:r>
+            </w:hyperlink>
           </w:p>
         </w:tc>
       </w:tr>
     </w:tbl>
-    <w:p>
-      <w:pPr>
-        <w:jc w:val="center"/>
-      </w:pPr>
-      <w:r>
-        <w:drawing>
-          <wp:inline xmlns:a="http://schemas.openxmlformats.org/drawingml/2006/main" xmlns:pic="http://schemas.openxmlformats.org/drawingml/2006/picture">
-            <wp:extent cx="5760000" cy="2094545"/>
-            <wp:docPr id="1" name="Picture 1"/>
-            <wp:cNvGraphicFramePr>
-              <a:graphicFrameLocks noChangeAspect="1"/>
-            </wp:cNvGraphicFramePr>
-            <a:graphic>
-              <a:graphicData uri="http://schemas.openxmlformats.org/drawingml/2006/picture">
-                <pic:pic>
-                  <pic:nvPicPr>
-                    <pic:cNvPr id="0" name="learning_curves.png"/>
-                    <pic:cNvPicPr/>
-                  </pic:nvPicPr>
-                  <pic:blipFill>
-                    <a:blip r:embed="rId9"/>
-                    <a:stretch>
-                      <a:fillRect/>
-                    </a:stretch>
-                  </pic:blipFill>
-                  <pic:spPr>
-                    <a:xfrm>
-                      <a:off x="0" y="0"/>
-                      <a:ext cx="5760000" cy="2094545"/>
-                    </a:xfrm>
-                    <a:prstGeom prst="rect"/>
-                  </pic:spPr>
-                </pic:pic>
-              </a:graphicData>
-            </a:graphic>
-          </wp:inline>
-        </w:drawing>
-      </w:r>
-    </w:p>
-    <w:p>
-      <w:pPr>
-        <w:pStyle w:val="Heading2"/>
-      </w:pPr>
-      <w:r>
-        <w:t>4. Temperature Analysis</w:t>
-      </w:r>
-    </w:p>
-    <w:p>
-      <w:r>
-        <w:t>Each model continued three prompts for 40 words at T = 0.3, 0.7, 1.0 and 1.3. Only newly generated words are scored. Distinct-n is unique n-grams divided by total n-grams; repeated trigrams is the share of trigrams already seen in the same output.</w:t>
-      </w:r>
-    </w:p>
-    <w:tbl>
-      <w:tblPr>
-        <w:tblStyle w:val="LightGrid-Accent1"/>
-        <w:tblW w:type="auto" w:w="0"/>
-        <w:jc w:val="center"/>
-        <w:tblLook w:firstColumn="1" w:firstRow="1" w:lastColumn="0" w:lastRow="0" w:noHBand="0" w:noVBand="1" w:val="04A0"/>
-      </w:tblPr>
-      <w:tblGrid>
-        <w:gridCol w:w="1994"/>
-        <w:gridCol w:w="1994"/>
-        <w:gridCol w:w="1994"/>
-        <w:gridCol w:w="1994"/>
-        <w:gridCol w:w="1994"/>
-      </w:tblGrid>
-      <w:tr>
-        <w:tc>
-          <w:tcPr>
-            <w:tcW w:type="dxa" w:w="1994"/>
-          </w:tcPr>
-          <w:p>
-            <w:r>
-              <w:rPr>
-                <w:b/>
-                <w:sz w:val="18"/>
-              </w:rPr>
-              <w:t>Model</w:t>
-            </w:r>
-          </w:p>
-        </w:tc>
-        <w:tc>
-          <w:tcPr>
-            <w:tcW w:type="dxa" w:w="1994"/>
-          </w:tcPr>
-          <w:p>
-            <w:r>
-              <w:rPr>
-                <w:b/>
-                <w:sz w:val="18"/>
-              </w:rPr>
-              <w:t>T</w:t>
-            </w:r>
-          </w:p>
-        </w:tc>
-        <w:tc>
-          <w:tcPr>
-            <w:tcW w:type="dxa" w:w="1994"/>
-          </w:tcPr>
-          <w:p>
-            <w:r>
-              <w:rPr>
-                <w:b/>
-                <w:sz w:val="18"/>
-              </w:rPr>
-              <w:t>Distinct-1</w:t>
-            </w:r>
-          </w:p>
-        </w:tc>
-        <w:tc>
-          <w:tcPr>
-            <w:tcW w:type="dxa" w:w="1994"/>
-          </w:tcPr>
-          <w:p>
-            <w:r>
-              <w:rPr>
-                <w:b/>
-                <w:sz w:val="18"/>
-              </w:rPr>
-              <w:t>Distinct-2</w:t>
-            </w:r>
-          </w:p>
-        </w:tc>
-        <w:tc>
-          <w:tcPr>
-            <w:tcW w:type="dxa" w:w="1994"/>
-          </w:tcPr>
-          <w:p>
-            <w:r>
-              <w:rPr>
-                <w:b/>
-                <w:sz w:val="18"/>
-              </w:rPr>
-              <w:t>Repeated trigrams</w:t>
-            </w:r>
-          </w:p>
-        </w:tc>
-      </w:tr>
-      <w:tr>
-        <w:tc>
-          <w:tcPr>
-            <w:tcW w:type="dxa" w:w="1994"/>
-          </w:tcPr>
-          <w:p>
-            <w:r>
-              <w:rPr>
-                <w:sz w:val="18"/>
-              </w:rPr>
-              <w:t>Simple RNN</w:t>
-            </w:r>
-          </w:p>
-        </w:tc>
-        <w:tc>
-          <w:tcPr>
-            <w:tcW w:type="dxa" w:w="1994"/>
-          </w:tcPr>
-          <w:p>
-            <w:r>
-              <w:rPr>
-                <w:sz w:val="18"/>
-              </w:rPr>
-              <w:t>0.3</w:t>
-            </w:r>
-          </w:p>
-        </w:tc>
-        <w:tc>
-          <w:tcPr>
-            <w:tcW w:type="dxa" w:w="1994"/>
-          </w:tcPr>
-          <w:p>
-            <w:r>
-              <w:rPr>
-                <w:sz w:val="18"/>
-              </w:rPr>
-              <w:t>0.533</w:t>
-            </w:r>
-          </w:p>
-        </w:tc>
-        <w:tc>
-          <w:tcPr>
-            <w:tcW w:type="dxa" w:w="1994"/>
-          </w:tcPr>
-          <w:p>
-            <w:r>
-              <w:rPr>
-                <w:sz w:val="18"/>
-              </w:rPr>
-              <w:t>0.718</w:t>
-            </w:r>
-          </w:p>
-        </w:tc>
-        <w:tc>
-          <w:tcPr>
-            <w:tcW w:type="dxa" w:w="1994"/>
-          </w:tcPr>
-          <w:p>
-            <w:r>
-              <w:rPr>
-                <w:sz w:val="18"/>
-              </w:rPr>
-              <w:t>0.184</w:t>
-            </w:r>
-          </w:p>
-        </w:tc>
-      </w:tr>
-      <w:tr>
-        <w:tc>
-          <w:tcPr>
-            <w:tcW w:type="dxa" w:w="1994"/>
-          </w:tcPr>
-          <w:p>
-            <w:r>
-              <w:rPr>
-                <w:sz w:val="18"/>
-              </w:rPr>
-              <w:t>Simple RNN</w:t>
-            </w:r>
-          </w:p>
-        </w:tc>
-        <w:tc>
-          <w:tcPr>
-            <w:tcW w:type="dxa" w:w="1994"/>
-          </w:tcPr>
-          <w:p>
-            <w:r>
-              <w:rPr>
-                <w:sz w:val="18"/>
-              </w:rPr>
-              <w:t>0.7</w:t>
-            </w:r>
-          </w:p>
-        </w:tc>
-        <w:tc>
-          <w:tcPr>
-            <w:tcW w:type="dxa" w:w="1994"/>
-          </w:tcPr>
-          <w:p>
-            <w:r>
-              <w:rPr>
-                <w:sz w:val="18"/>
-              </w:rPr>
-              <w:t>0.783</w:t>
-            </w:r>
-          </w:p>
-        </w:tc>
-        <w:tc>
-          <w:tcPr>
-            <w:tcW w:type="dxa" w:w="1994"/>
-          </w:tcPr>
-          <w:p>
-            <w:r>
-              <w:rPr>
-                <w:sz w:val="18"/>
-              </w:rPr>
-              <w:t>0.992</w:t>
-            </w:r>
-          </w:p>
-        </w:tc>
-        <w:tc>
-          <w:tcPr>
-            <w:tcW w:type="dxa" w:w="1994"/>
-          </w:tcPr>
-          <w:p>
-            <w:r>
-              <w:rPr>
-                <w:sz w:val="18"/>
-              </w:rPr>
-              <w:t>0.000</w:t>
-            </w:r>
-          </w:p>
-        </w:tc>
-      </w:tr>
-      <w:tr>
-        <w:tc>
-          <w:tcPr>
-            <w:tcW w:type="dxa" w:w="1994"/>
-          </w:tcPr>
-          <w:p>
-            <w:r>
-              <w:rPr>
-                <w:sz w:val="18"/>
-              </w:rPr>
-              <w:t>Simple RNN</w:t>
-            </w:r>
-          </w:p>
-        </w:tc>
-        <w:tc>
-          <w:tcPr>
-            <w:tcW w:type="dxa" w:w="1994"/>
-          </w:tcPr>
-          <w:p>
-            <w:r>
-              <w:rPr>
-                <w:sz w:val="18"/>
-              </w:rPr>
-              <w:t>1.0</w:t>
-            </w:r>
-          </w:p>
-        </w:tc>
-        <w:tc>
-          <w:tcPr>
-            <w:tcW w:type="dxa" w:w="1994"/>
-          </w:tcPr>
-          <w:p>
-            <w:r>
-              <w:rPr>
-                <w:sz w:val="18"/>
-              </w:rPr>
-              <w:t>0.783</w:t>
-            </w:r>
-          </w:p>
-        </w:tc>
-        <w:tc>
-          <w:tcPr>
-            <w:tcW w:type="dxa" w:w="1994"/>
-          </w:tcPr>
-          <w:p>
-            <w:r>
-              <w:rPr>
-                <w:sz w:val="18"/>
-              </w:rPr>
-              <w:t>0.992</w:t>
-            </w:r>
-          </w:p>
-        </w:tc>
-        <w:tc>
-          <w:tcPr>
-            <w:tcW w:type="dxa" w:w="1994"/>
-          </w:tcPr>
-          <w:p>
-            <w:r>
-              <w:rPr>
-                <w:sz w:val="18"/>
-              </w:rPr>
-              <w:t>0.000</w:t>
-            </w:r>
-          </w:p>
-        </w:tc>
-      </w:tr>
-      <w:tr>
-        <w:tc>
-          <w:tcPr>
-            <w:tcW w:type="dxa" w:w="1994"/>
-          </w:tcPr>
-          <w:p>
-            <w:r>
-              <w:rPr>
-                <w:sz w:val="18"/>
-              </w:rPr>
-              <w:t>Simple RNN</w:t>
-            </w:r>
-          </w:p>
-        </w:tc>
-        <w:tc>
-          <w:tcPr>
-            <w:tcW w:type="dxa" w:w="1994"/>
-          </w:tcPr>
-          <w:p>
-            <w:r>
-              <w:rPr>
-                <w:sz w:val="18"/>
-              </w:rPr>
-              <w:t>1.3</w:t>
-            </w:r>
-          </w:p>
-        </w:tc>
-        <w:tc>
-          <w:tcPr>
-            <w:tcW w:type="dxa" w:w="1994"/>
-          </w:tcPr>
-          <w:p>
-            <w:r>
-              <w:rPr>
-                <w:sz w:val="18"/>
-              </w:rPr>
-              <w:t>0.858</w:t>
-            </w:r>
-          </w:p>
-        </w:tc>
-        <w:tc>
-          <w:tcPr>
-            <w:tcW w:type="dxa" w:w="1994"/>
-          </w:tcPr>
-          <w:p>
-            <w:r>
-              <w:rPr>
-                <w:sz w:val="18"/>
-              </w:rPr>
-              <w:t>0.992</w:t>
-            </w:r>
-          </w:p>
-        </w:tc>
-        <w:tc>
-          <w:tcPr>
-            <w:tcW w:type="dxa" w:w="1994"/>
-          </w:tcPr>
-          <w:p>
-            <w:r>
-              <w:rPr>
-                <w:sz w:val="18"/>
-              </w:rPr>
-              <w:t>0.000</w:t>
-            </w:r>
-          </w:p>
-        </w:tc>
-      </w:tr>
-      <w:tr>
-        <w:tc>
-          <w:tcPr>
-            <w:tcW w:type="dxa" w:w="1994"/>
-          </w:tcPr>
-          <w:p>
-            <w:r>
-              <w:rPr>
-                <w:sz w:val="18"/>
-              </w:rPr>
-              <w:t>Bidirectional RNN</w:t>
-            </w:r>
-          </w:p>
-        </w:tc>
-        <w:tc>
-          <w:tcPr>
-            <w:tcW w:type="dxa" w:w="1994"/>
-          </w:tcPr>
-          <w:p>
-            <w:r>
-              <w:rPr>
-                <w:sz w:val="18"/>
-              </w:rPr>
-              <w:t>0.3</w:t>
-            </w:r>
-          </w:p>
-        </w:tc>
-        <w:tc>
-          <w:tcPr>
-            <w:tcW w:type="dxa" w:w="1994"/>
-          </w:tcPr>
-          <w:p>
-            <w:r>
-              <w:rPr>
-                <w:sz w:val="18"/>
-              </w:rPr>
-              <w:t>0.442</w:t>
-            </w:r>
-          </w:p>
-        </w:tc>
-        <w:tc>
-          <w:tcPr>
-            <w:tcW w:type="dxa" w:w="1994"/>
-          </w:tcPr>
-          <w:p>
-            <w:r>
-              <w:rPr>
-                <w:sz w:val="18"/>
-              </w:rPr>
-              <w:t>0.684</w:t>
-            </w:r>
-          </w:p>
-        </w:tc>
-        <w:tc>
-          <w:tcPr>
-            <w:tcW w:type="dxa" w:w="1994"/>
-          </w:tcPr>
-          <w:p>
-            <w:r>
-              <w:rPr>
-                <w:sz w:val="18"/>
-              </w:rPr>
-              <w:t>0.123</w:t>
-            </w:r>
-          </w:p>
-        </w:tc>
-      </w:tr>
-      <w:tr>
-        <w:tc>
-          <w:tcPr>
-            <w:tcW w:type="dxa" w:w="1994"/>
-          </w:tcPr>
-          <w:p>
-            <w:r>
-              <w:rPr>
-                <w:sz w:val="18"/>
-              </w:rPr>
-              <w:t>Bidirectional RNN</w:t>
-            </w:r>
-          </w:p>
-        </w:tc>
-        <w:tc>
-          <w:tcPr>
-            <w:tcW w:type="dxa" w:w="1994"/>
-          </w:tcPr>
-          <w:p>
-            <w:r>
-              <w:rPr>
-                <w:sz w:val="18"/>
-              </w:rPr>
-              <w:t>0.7</w:t>
-            </w:r>
-          </w:p>
-        </w:tc>
-        <w:tc>
-          <w:tcPr>
-            <w:tcW w:type="dxa" w:w="1994"/>
-          </w:tcPr>
-          <w:p>
-            <w:r>
-              <w:rPr>
-                <w:sz w:val="18"/>
-              </w:rPr>
-              <w:t>0.683</w:t>
-            </w:r>
-          </w:p>
-        </w:tc>
-        <w:tc>
-          <w:tcPr>
-            <w:tcW w:type="dxa" w:w="1994"/>
-          </w:tcPr>
-          <w:p>
-            <w:r>
-              <w:rPr>
-                <w:sz w:val="18"/>
-              </w:rPr>
-              <w:t>0.974</w:t>
-            </w:r>
-          </w:p>
-        </w:tc>
-        <w:tc>
-          <w:tcPr>
-            <w:tcW w:type="dxa" w:w="1994"/>
-          </w:tcPr>
-          <w:p>
-            <w:r>
-              <w:rPr>
-                <w:sz w:val="18"/>
-              </w:rPr>
-              <w:t>0.000</w:t>
-            </w:r>
-          </w:p>
-        </w:tc>
-      </w:tr>
-      <w:tr>
-        <w:tc>
-          <w:tcPr>
-            <w:tcW w:type="dxa" w:w="1994"/>
-          </w:tcPr>
-          <w:p>
-            <w:r>
-              <w:rPr>
-                <w:sz w:val="18"/>
-              </w:rPr>
-              <w:t>Bidirectional RNN</w:t>
-            </w:r>
-          </w:p>
-        </w:tc>
-        <w:tc>
-          <w:tcPr>
-            <w:tcW w:type="dxa" w:w="1994"/>
-          </w:tcPr>
-          <w:p>
-            <w:r>
-              <w:rPr>
-                <w:sz w:val="18"/>
-              </w:rPr>
-              <w:t>1.0</w:t>
-            </w:r>
-          </w:p>
-        </w:tc>
-        <w:tc>
-          <w:tcPr>
-            <w:tcW w:type="dxa" w:w="1994"/>
-          </w:tcPr>
-          <w:p>
-            <w:r>
-              <w:rPr>
-                <w:sz w:val="18"/>
-              </w:rPr>
-              <w:t>0.767</w:t>
-            </w:r>
-          </w:p>
-        </w:tc>
-        <w:tc>
-          <w:tcPr>
-            <w:tcW w:type="dxa" w:w="1994"/>
-          </w:tcPr>
-          <w:p>
-            <w:r>
-              <w:rPr>
-                <w:sz w:val="18"/>
-              </w:rPr>
-              <w:t>0.983</w:t>
-            </w:r>
-          </w:p>
-        </w:tc>
-        <w:tc>
-          <w:tcPr>
-            <w:tcW w:type="dxa" w:w="1994"/>
-          </w:tcPr>
-          <w:p>
-            <w:r>
-              <w:rPr>
-                <w:sz w:val="18"/>
-              </w:rPr>
-              <w:t>0.000</w:t>
-            </w:r>
-          </w:p>
-        </w:tc>
-      </w:tr>
-      <w:tr>
-        <w:tc>
-          <w:tcPr>
-            <w:tcW w:type="dxa" w:w="1994"/>
-          </w:tcPr>
-          <w:p>
-            <w:r>
-              <w:rPr>
-                <w:sz w:val="18"/>
-              </w:rPr>
-              <w:t>Bidirectional RNN</w:t>
-            </w:r>
-          </w:p>
-        </w:tc>
-        <w:tc>
-          <w:tcPr>
-            <w:tcW w:type="dxa" w:w="1994"/>
-          </w:tcPr>
-          <w:p>
-            <w:r>
-              <w:rPr>
-                <w:sz w:val="18"/>
-              </w:rPr>
-              <w:t>1.3</w:t>
-            </w:r>
-          </w:p>
-        </w:tc>
-        <w:tc>
-          <w:tcPr>
-            <w:tcW w:type="dxa" w:w="1994"/>
-          </w:tcPr>
-          <w:p>
-            <w:r>
-              <w:rPr>
-                <w:sz w:val="18"/>
-              </w:rPr>
-              <w:t>0.875</w:t>
-            </w:r>
-          </w:p>
-        </w:tc>
-        <w:tc>
-          <w:tcPr>
-            <w:tcW w:type="dxa" w:w="1994"/>
-          </w:tcPr>
-          <w:p>
-            <w:r>
-              <w:rPr>
-                <w:sz w:val="18"/>
-              </w:rPr>
-              <w:t>1.000</w:t>
-            </w:r>
-          </w:p>
-        </w:tc>
-        <w:tc>
-          <w:tcPr>
-            <w:tcW w:type="dxa" w:w="1994"/>
-          </w:tcPr>
-          <w:p>
-            <w:r>
-              <w:rPr>
-                <w:sz w:val="18"/>
-              </w:rPr>
-              <w:t>0.000</w:t>
-            </w:r>
-          </w:p>
-        </w:tc>
-      </w:tr>
-      <w:tr>
-        <w:tc>
-          <w:tcPr>
-            <w:tcW w:type="dxa" w:w="1994"/>
-          </w:tcPr>
-          <w:p>
-            <w:r>
-              <w:rPr>
-                <w:sz w:val="18"/>
-              </w:rPr>
-              <w:t>LSTM</w:t>
-            </w:r>
-          </w:p>
-        </w:tc>
-        <w:tc>
-          <w:tcPr>
-            <w:tcW w:type="dxa" w:w="1994"/>
-          </w:tcPr>
-          <w:p>
-            <w:r>
-              <w:rPr>
-                <w:sz w:val="18"/>
-              </w:rPr>
-              <w:t>0.3</w:t>
-            </w:r>
-          </w:p>
-        </w:tc>
-        <w:tc>
-          <w:tcPr>
-            <w:tcW w:type="dxa" w:w="1994"/>
-          </w:tcPr>
-          <w:p>
-            <w:r>
-              <w:rPr>
-                <w:sz w:val="18"/>
-              </w:rPr>
-              <w:t>0.600</w:t>
-            </w:r>
-          </w:p>
-        </w:tc>
-        <w:tc>
-          <w:tcPr>
-            <w:tcW w:type="dxa" w:w="1994"/>
-          </w:tcPr>
-          <w:p>
-            <w:r>
-              <w:rPr>
-                <w:sz w:val="18"/>
-              </w:rPr>
-              <w:t>0.838</w:t>
-            </w:r>
-          </w:p>
-        </w:tc>
-        <w:tc>
-          <w:tcPr>
-            <w:tcW w:type="dxa" w:w="1994"/>
-          </w:tcPr>
-          <w:p>
-            <w:r>
-              <w:rPr>
-                <w:sz w:val="18"/>
-              </w:rPr>
-              <w:t>0.061</w:t>
-            </w:r>
-          </w:p>
-        </w:tc>
-      </w:tr>
-      <w:tr>
-        <w:tc>
-          <w:tcPr>
-            <w:tcW w:type="dxa" w:w="1994"/>
-          </w:tcPr>
-          <w:p>
-            <w:r>
-              <w:rPr>
-                <w:sz w:val="18"/>
-              </w:rPr>
-              <w:t>LSTM</w:t>
-            </w:r>
-          </w:p>
-        </w:tc>
-        <w:tc>
-          <w:tcPr>
-            <w:tcW w:type="dxa" w:w="1994"/>
-          </w:tcPr>
-          <w:p>
-            <w:r>
-              <w:rPr>
-                <w:sz w:val="18"/>
-              </w:rPr>
-              <w:t>0.7</w:t>
-            </w:r>
-          </w:p>
-        </w:tc>
-        <w:tc>
-          <w:tcPr>
-            <w:tcW w:type="dxa" w:w="1994"/>
-          </w:tcPr>
-          <w:p>
-            <w:r>
-              <w:rPr>
-                <w:sz w:val="18"/>
-              </w:rPr>
-              <w:t>0.733</w:t>
-            </w:r>
-          </w:p>
-        </w:tc>
-        <w:tc>
-          <w:tcPr>
-            <w:tcW w:type="dxa" w:w="1994"/>
-          </w:tcPr>
-          <w:p>
-            <w:r>
-              <w:rPr>
-                <w:sz w:val="18"/>
-              </w:rPr>
-              <w:t>0.957</w:t>
-            </w:r>
-          </w:p>
-        </w:tc>
-        <w:tc>
-          <w:tcPr>
-            <w:tcW w:type="dxa" w:w="1994"/>
-          </w:tcPr>
-          <w:p>
-            <w:r>
-              <w:rPr>
-                <w:sz w:val="18"/>
-              </w:rPr>
-              <w:t>0.018</w:t>
-            </w:r>
-          </w:p>
-        </w:tc>
-      </w:tr>
-      <w:tr>
-        <w:tc>
-          <w:tcPr>
-            <w:tcW w:type="dxa" w:w="1994"/>
-          </w:tcPr>
-          <w:p>
-            <w:r>
-              <w:rPr>
-                <w:sz w:val="18"/>
-              </w:rPr>
-              <w:t>LSTM</w:t>
-            </w:r>
-          </w:p>
-        </w:tc>
-        <w:tc>
-          <w:tcPr>
-            <w:tcW w:type="dxa" w:w="1994"/>
-          </w:tcPr>
-          <w:p>
-            <w:r>
-              <w:rPr>
-                <w:sz w:val="18"/>
-              </w:rPr>
-              <w:t>1.0</w:t>
-            </w:r>
-          </w:p>
-        </w:tc>
-        <w:tc>
-          <w:tcPr>
-            <w:tcW w:type="dxa" w:w="1994"/>
-          </w:tcPr>
-          <w:p>
-            <w:r>
-              <w:rPr>
-                <w:sz w:val="18"/>
-              </w:rPr>
-              <w:t>0.750</w:t>
-            </w:r>
-          </w:p>
-        </w:tc>
-        <w:tc>
-          <w:tcPr>
-            <w:tcW w:type="dxa" w:w="1994"/>
-          </w:tcPr>
-          <w:p>
-            <w:r>
-              <w:rPr>
-                <w:sz w:val="18"/>
-              </w:rPr>
-              <w:t>0.957</w:t>
-            </w:r>
-          </w:p>
-        </w:tc>
-        <w:tc>
-          <w:tcPr>
-            <w:tcW w:type="dxa" w:w="1994"/>
-          </w:tcPr>
-          <w:p>
-            <w:r>
-              <w:rPr>
-                <w:sz w:val="18"/>
-              </w:rPr>
-              <w:t>0.018</w:t>
-            </w:r>
-          </w:p>
-        </w:tc>
-      </w:tr>
-      <w:tr>
-        <w:tc>
-          <w:tcPr>
-            <w:tcW w:type="dxa" w:w="1994"/>
-          </w:tcPr>
-          <w:p>
-            <w:r>
-              <w:rPr>
-                <w:sz w:val="18"/>
-              </w:rPr>
-              <w:t>LSTM</w:t>
-            </w:r>
-          </w:p>
-        </w:tc>
-        <w:tc>
-          <w:tcPr>
-            <w:tcW w:type="dxa" w:w="1994"/>
-          </w:tcPr>
-          <w:p>
-            <w:r>
-              <w:rPr>
-                <w:sz w:val="18"/>
-              </w:rPr>
-              <w:t>1.3</w:t>
-            </w:r>
-          </w:p>
-        </w:tc>
-        <w:tc>
-          <w:tcPr>
-            <w:tcW w:type="dxa" w:w="1994"/>
-          </w:tcPr>
-          <w:p>
-            <w:r>
-              <w:rPr>
-                <w:sz w:val="18"/>
-              </w:rPr>
-              <w:t>0.842</w:t>
-            </w:r>
-          </w:p>
-        </w:tc>
-        <w:tc>
-          <w:tcPr>
-            <w:tcW w:type="dxa" w:w="1994"/>
-          </w:tcPr>
-          <w:p>
-            <w:r>
-              <w:rPr>
-                <w:sz w:val="18"/>
-              </w:rPr>
-              <w:t>0.992</w:t>
-            </w:r>
-          </w:p>
-        </w:tc>
-        <w:tc>
-          <w:tcPr>
-            <w:tcW w:type="dxa" w:w="1994"/>
-          </w:tcPr>
-          <w:p>
-            <w:r>
-              <w:rPr>
-                <w:sz w:val="18"/>
-              </w:rPr>
-              <w:t>0.000</w:t>
-            </w:r>
-          </w:p>
-        </w:tc>
-      </w:tr>
-      <w:tr>
-        <w:tc>
-          <w:tcPr>
-            <w:tcW w:type="dxa" w:w="1994"/>
-          </w:tcPr>
-          <w:p>
-            <w:r>
-              <w:rPr>
-                <w:sz w:val="18"/>
-              </w:rPr>
-              <w:t>GRU</w:t>
-            </w:r>
-          </w:p>
-        </w:tc>
-        <w:tc>
-          <w:tcPr>
-            <w:tcW w:type="dxa" w:w="1994"/>
-          </w:tcPr>
-          <w:p>
-            <w:r>
-              <w:rPr>
-                <w:sz w:val="18"/>
-              </w:rPr>
-              <w:t>0.3</w:t>
-            </w:r>
-          </w:p>
-        </w:tc>
-        <w:tc>
-          <w:tcPr>
-            <w:tcW w:type="dxa" w:w="1994"/>
-          </w:tcPr>
-          <w:p>
-            <w:r>
-              <w:rPr>
-                <w:sz w:val="18"/>
-              </w:rPr>
-              <w:t>0.608</w:t>
-            </w:r>
-          </w:p>
-        </w:tc>
-        <w:tc>
-          <w:tcPr>
-            <w:tcW w:type="dxa" w:w="1994"/>
-          </w:tcPr>
-          <w:p>
-            <w:r>
-              <w:rPr>
-                <w:sz w:val="18"/>
-              </w:rPr>
-              <w:t>0.812</w:t>
-            </w:r>
-          </w:p>
-        </w:tc>
-        <w:tc>
-          <w:tcPr>
-            <w:tcW w:type="dxa" w:w="1994"/>
-          </w:tcPr>
-          <w:p>
-            <w:r>
-              <w:rPr>
-                <w:sz w:val="18"/>
-              </w:rPr>
-              <w:t>0.079</w:t>
-            </w:r>
-          </w:p>
-        </w:tc>
-      </w:tr>
-      <w:tr>
-        <w:tc>
-          <w:tcPr>
-            <w:tcW w:type="dxa" w:w="1994"/>
-          </w:tcPr>
-          <w:p>
-            <w:r>
-              <w:rPr>
-                <w:sz w:val="18"/>
-              </w:rPr>
-              <w:t>GRU</w:t>
-            </w:r>
-          </w:p>
-        </w:tc>
-        <w:tc>
-          <w:tcPr>
-            <w:tcW w:type="dxa" w:w="1994"/>
-          </w:tcPr>
-          <w:p>
-            <w:r>
-              <w:rPr>
-                <w:sz w:val="18"/>
-              </w:rPr>
-              <w:t>0.7</w:t>
-            </w:r>
-          </w:p>
-        </w:tc>
-        <w:tc>
-          <w:tcPr>
-            <w:tcW w:type="dxa" w:w="1994"/>
-          </w:tcPr>
-          <w:p>
-            <w:r>
-              <w:rPr>
-                <w:sz w:val="18"/>
-              </w:rPr>
-              <w:t>0.725</w:t>
-            </w:r>
-          </w:p>
-        </w:tc>
-        <w:tc>
-          <w:tcPr>
-            <w:tcW w:type="dxa" w:w="1994"/>
-          </w:tcPr>
-          <w:p>
-            <w:r>
-              <w:rPr>
-                <w:sz w:val="18"/>
-              </w:rPr>
-              <w:t>0.957</w:t>
-            </w:r>
-          </w:p>
-        </w:tc>
-        <w:tc>
-          <w:tcPr>
-            <w:tcW w:type="dxa" w:w="1994"/>
-          </w:tcPr>
-          <w:p>
-            <w:r>
-              <w:rPr>
-                <w:sz w:val="18"/>
-              </w:rPr>
-              <w:t>0.009</w:t>
-            </w:r>
-          </w:p>
-        </w:tc>
-      </w:tr>
-      <w:tr>
-        <w:tc>
-          <w:tcPr>
-            <w:tcW w:type="dxa" w:w="1994"/>
-          </w:tcPr>
-          <w:p>
-            <w:r>
-              <w:rPr>
-                <w:sz w:val="18"/>
-              </w:rPr>
-              <w:t>GRU</w:t>
-            </w:r>
-          </w:p>
-        </w:tc>
-        <w:tc>
-          <w:tcPr>
-            <w:tcW w:type="dxa" w:w="1994"/>
-          </w:tcPr>
-          <w:p>
-            <w:r>
-              <w:rPr>
-                <w:sz w:val="18"/>
-              </w:rPr>
-              <w:t>1.0</w:t>
-            </w:r>
-          </w:p>
-        </w:tc>
-        <w:tc>
-          <w:tcPr>
-            <w:tcW w:type="dxa" w:w="1994"/>
-          </w:tcPr>
-          <w:p>
-            <w:r>
-              <w:rPr>
-                <w:sz w:val="18"/>
-              </w:rPr>
-              <w:t>0.800</w:t>
-            </w:r>
-          </w:p>
-        </w:tc>
-        <w:tc>
-          <w:tcPr>
-            <w:tcW w:type="dxa" w:w="1994"/>
-          </w:tcPr>
-          <w:p>
-            <w:r>
-              <w:rPr>
-                <w:sz w:val="18"/>
-              </w:rPr>
-              <w:t>0.983</w:t>
-            </w:r>
-          </w:p>
-        </w:tc>
-        <w:tc>
-          <w:tcPr>
-            <w:tcW w:type="dxa" w:w="1994"/>
-          </w:tcPr>
-          <w:p>
-            <w:r>
-              <w:rPr>
-                <w:sz w:val="18"/>
-              </w:rPr>
-              <w:t>0.000</w:t>
-            </w:r>
-          </w:p>
-        </w:tc>
-      </w:tr>
-      <w:tr>
-        <w:tc>
-          <w:tcPr>
-            <w:tcW w:type="dxa" w:w="1994"/>
-          </w:tcPr>
-          <w:p>
-            <w:r>
-              <w:rPr>
-                <w:sz w:val="18"/>
-              </w:rPr>
-              <w:t>GRU</w:t>
-            </w:r>
-          </w:p>
-        </w:tc>
-        <w:tc>
-          <w:tcPr>
-            <w:tcW w:type="dxa" w:w="1994"/>
-          </w:tcPr>
-          <w:p>
-            <w:r>
-              <w:rPr>
-                <w:sz w:val="18"/>
-              </w:rPr>
-              <w:t>1.3</w:t>
-            </w:r>
-          </w:p>
-        </w:tc>
-        <w:tc>
-          <w:tcPr>
-            <w:tcW w:type="dxa" w:w="1994"/>
-          </w:tcPr>
-          <w:p>
-            <w:r>
-              <w:rPr>
-                <w:sz w:val="18"/>
-              </w:rPr>
-              <w:t>0.858</w:t>
-            </w:r>
-          </w:p>
-        </w:tc>
-        <w:tc>
-          <w:tcPr>
-            <w:tcW w:type="dxa" w:w="1994"/>
-          </w:tcPr>
-          <w:p>
-            <w:r>
-              <w:rPr>
-                <w:sz w:val="18"/>
-              </w:rPr>
-              <w:t>1.000</w:t>
-            </w:r>
-          </w:p>
-        </w:tc>
-        <w:tc>
-          <w:tcPr>
-            <w:tcW w:type="dxa" w:w="1994"/>
-          </w:tcPr>
-          <w:p>
-            <w:r>
-              <w:rPr>
-                <w:sz w:val="18"/>
-              </w:rPr>
-              <w:t>0.000</w:t>
-            </w:r>
-          </w:p>
-        </w:tc>
-      </w:tr>
-    </w:tbl>
-    <w:p>
-      <w:pPr>
-        <w:jc w:val="center"/>
-      </w:pPr>
-      <w:r>
-        <w:drawing>
-          <wp:inline xmlns:a="http://schemas.openxmlformats.org/drawingml/2006/main" xmlns:pic="http://schemas.openxmlformats.org/drawingml/2006/picture">
-            <wp:extent cx="5760000" cy="2094545"/>
-            <wp:docPr id="2" name="Picture 2"/>
-            <wp:cNvGraphicFramePr>
-              <a:graphicFrameLocks noChangeAspect="1"/>
-            </wp:cNvGraphicFramePr>
-            <a:graphic>
-              <a:graphicData uri="http://schemas.openxmlformats.org/drawingml/2006/picture">
-                <pic:pic>
-                  <pic:nvPicPr>
-                    <pic:cNvPr id="0" name="temperature_effect.png"/>
-                    <pic:cNvPicPr/>
-                  </pic:nvPicPr>
-                  <pic:blipFill>
-                    <a:blip r:embed="rId10"/>
-                    <a:stretch>
-                      <a:fillRect/>
-                    </a:stretch>
-                  </pic:blipFill>
-                  <pic:spPr>
-                    <a:xfrm>
-                      <a:off x="0" y="0"/>
-                      <a:ext cx="5760000" cy="2094545"/>
-                    </a:xfrm>
-                    <a:prstGeom prst="rect"/>
-                  </pic:spPr>
-                </pic:pic>
-              </a:graphicData>
-            </a:graphic>
-          </wp:inline>
-        </w:drawing>
-      </w:r>
-    </w:p>
-    <w:p>
-      <w:pPr>
-        <w:pStyle w:val="Heading2"/>
-      </w:pPr>
-      <w:r>
-        <w:t>5. Conclusions</w:t>
-      </w:r>
-    </w:p>
-    <w:p>
-      <w:pPr>
-        <w:pStyle w:val="ListBullet"/>
-      </w:pPr>
-      <w:r>
-        <w:t>LSTM is the best model, with test perplexity 60.3 and top-1 accuracy 21.9%. Gating helps keep useful context across the window.</w:t>
-      </w:r>
-    </w:p>
-    <w:p>
-      <w:pPr>
-        <w:pStyle w:val="ListBullet"/>
-      </w:pPr>
-      <w:r>
-        <w:t>The Simple RNN came close to the gated models: on a short 10-word window the vanishing-gradient problem is mild.</w:t>
-      </w:r>
-    </w:p>
-    <w:p>
-      <w:pPr>
-        <w:pStyle w:val="ListBullet"/>
-      </w:pPr>
-      <w:r>
-        <w:t>The Bidirectional RNN has the most parameters but the worst scores. Reading the window backwards adds little when the last few words matter most, and it overfits sooner. It stays autoregressive because its backward pass only reads past words in the window.</w:t>
-      </w:r>
-    </w:p>
-    <w:p>
-      <w:pPr>
-        <w:pStyle w:val="ListBullet"/>
-      </w:pPr>
-      <w:r>
-        <w:t>Low temperature (0.3) gives locally fluent but looping text; 0.7 gives the best balance; 1.0-1.3 maximises diversity but breaks grammar. Diversity metrics must be read together with perplexity and the actual samples.</w:t>
-      </w:r>
-    </w:p>
     <w:sectPr>
       <w:pgSz w:w="12240" w:h="15840"/>
-      <w:pgMar w:top="1020" w:right="1134" w:bottom="1020" w:left="1134" w:header="720" w:footer="720" w:gutter="0"/>
+      <w:pgMar w:top="1440" w:right="1440" w:bottom="1440" w:left="1440" w:header="720" w:footer="720" w:gutter="0"/>
       <w:cols w:space="720"/>
       <w:docGrid w:linePitch="360"/>
     </w:sectPr>
@@ -2461,10 +741,6 @@
     <w:name w:val="Normal"/>
     <w:qFormat/>
     <w:rsid w:val="00FC693F"/>
-    <w:rPr>
-      <w:rFonts w:ascii="Calibri" w:hAnsi="Calibri"/>
-      <w:sz w:val="21"/>
-    </w:rPr>
   </w:style>
   <w:style w:type="paragraph" w:styleId="Header">
     <w:name w:val="header"/>

</xml_diff>